<commit_message>
versão 1.0 da aplicação
versão 1.0 da aplicação com correções
</commit_message>
<xml_diff>
--- a/docs/regras_negocio.docx
+++ b/docs/regras_negocio.docx
@@ -68,7 +68,7 @@
           <w:bCs/>
         </w:rPr>
         <w:pict w14:anchorId="5AF432D3">
-          <v:rect id="_x0000_i1146" style="width:0;height:1.5pt" o:hralign="center" o:hrstd="t" o:hr="t" fillcolor="#a0a0a0" stroked="f"/>
+          <v:rect id="_x0000_i1025" style="width:0;height:1.5pt" o:hralign="center" o:hrstd="t" o:hr="t" fillcolor="#a0a0a0" stroked="f"/>
         </w:pict>
       </w:r>
     </w:p>
@@ -205,7 +205,23 @@
           <w:b/>
           <w:bCs/>
         </w:rPr>
-        <w:t>RN09. Quando uma funcionalidade depender de localização e o cliente não possuir localização disponível, o local poderá ser informado ou localizado manualmente.</w:t>
+        <w:t>RN09. Quando uma funcionalidade depender de localização e o cliente não possuir localização disponível, o local poderá ser informado</w:t>
+      </w:r>
+      <w:r>
+        <w:rPr>
+          <w:rFonts w:ascii="Arial" w:hAnsi="Arial" w:cs="Arial"/>
+          <w:b/>
+          <w:bCs/>
+        </w:rPr>
+        <w:t xml:space="preserve"> pela localização atua do dispositivo</w:t>
+      </w:r>
+      <w:r>
+        <w:rPr>
+          <w:rFonts w:ascii="Arial" w:hAnsi="Arial" w:cs="Arial"/>
+          <w:b/>
+          <w:bCs/>
+        </w:rPr>
+        <w:t xml:space="preserve"> ou localizado manualmente.</w:t>
       </w:r>
     </w:p>
     <w:p>
@@ -240,7 +256,7 @@
           <w:bCs/>
         </w:rPr>
         <w:pict w14:anchorId="654EC063">
-          <v:rect id="_x0000_i1147" style="width:0;height:1.5pt" o:hralign="center" o:hrstd="t" o:hr="t" fillcolor="#a0a0a0" stroked="f"/>
+          <v:rect id="_x0000_i1026" style="width:0;height:1.5pt" o:hralign="center" o:hrstd="t" o:hr="t" fillcolor="#a0a0a0" stroked="f"/>
         </w:pict>
       </w:r>
     </w:p>
@@ -379,7 +395,7 @@
           <w:bCs/>
         </w:rPr>
         <w:pict w14:anchorId="193779D9">
-          <v:rect id="_x0000_i1148" style="width:0;height:1.5pt" o:hralign="center" o:hrstd="t" o:hr="t" fillcolor="#a0a0a0" stroked="f"/>
+          <v:rect id="_x0000_i1027" style="width:0;height:1.5pt" o:hralign="center" o:hrstd="t" o:hr="t" fillcolor="#a0a0a0" stroked="f"/>
         </w:pict>
       </w:r>
     </w:p>
@@ -483,7 +499,7 @@
           <w:bCs/>
         </w:rPr>
         <w:pict w14:anchorId="004A322F">
-          <v:rect id="_x0000_i1149" style="width:0;height:1.5pt" o:hralign="center" o:hrstd="t" o:hr="t" fillcolor="#a0a0a0" stroked="f"/>
+          <v:rect id="_x0000_i1028" style="width:0;height:1.5pt" o:hralign="center" o:hrstd="t" o:hr="t" fillcolor="#a0a0a0" stroked="f"/>
         </w:pict>
       </w:r>
     </w:p>
@@ -621,7 +637,7 @@
           <w:bCs/>
         </w:rPr>
         <w:pict w14:anchorId="3973D8F7">
-          <v:rect id="_x0000_i1150" style="width:0;height:1.5pt" o:hralign="center" o:hrstd="t" o:hr="t" fillcolor="#a0a0a0" stroked="f"/>
+          <v:rect id="_x0000_i1029" style="width:0;height:1.5pt" o:hralign="center" o:hrstd="t" o:hr="t" fillcolor="#a0a0a0" stroked="f"/>
         </w:pict>
       </w:r>
     </w:p>
@@ -811,7 +827,7 @@
           <w:bCs/>
         </w:rPr>
         <w:pict w14:anchorId="2C5755CC">
-          <v:rect id="_x0000_i1151" style="width:0;height:1.5pt" o:hralign="center" o:hrstd="t" o:hr="t" fillcolor="#a0a0a0" stroked="f"/>
+          <v:rect id="_x0000_i1030" style="width:0;height:1.5pt" o:hralign="center" o:hrstd="t" o:hr="t" fillcolor="#a0a0a0" stroked="f"/>
         </w:pict>
       </w:r>
     </w:p>
@@ -1035,7 +1051,7 @@
           <w:bCs/>
         </w:rPr>
         <w:pict w14:anchorId="2D8341B6">
-          <v:rect id="_x0000_i1152" style="width:0;height:1.5pt" o:hralign="center" o:hrstd="t" o:hr="t" fillcolor="#a0a0a0" stroked="f"/>
+          <v:rect id="_x0000_i1031" style="width:0;height:1.5pt" o:hralign="center" o:hrstd="t" o:hr="t" fillcolor="#a0a0a0" stroked="f"/>
         </w:pict>
       </w:r>
     </w:p>
@@ -1241,7 +1257,7 @@
           <w:bCs/>
         </w:rPr>
         <w:pict w14:anchorId="1F7CAB5A">
-          <v:rect id="_x0000_i1153" style="width:0;height:1.5pt" o:hralign="center" o:hrstd="t" o:hr="t" fillcolor="#a0a0a0" stroked="f"/>
+          <v:rect id="_x0000_i1032" style="width:0;height:1.5pt" o:hralign="center" o:hrstd="t" o:hr="t" fillcolor="#a0a0a0" stroked="f"/>
         </w:pict>
       </w:r>
     </w:p>
@@ -1346,7 +1362,7 @@
           <w:bCs/>
         </w:rPr>
         <w:pict w14:anchorId="0CC65312">
-          <v:rect id="_x0000_i1154" style="width:0;height:1.5pt" o:hralign="center" o:hrstd="t" o:hr="t" fillcolor="#a0a0a0" stroked="f"/>
+          <v:rect id="_x0000_i1033" style="width:0;height:1.5pt" o:hralign="center" o:hrstd="t" o:hr="t" fillcolor="#a0a0a0" stroked="f"/>
         </w:pict>
       </w:r>
     </w:p>
@@ -1398,25 +1414,7 @@
           <w:b/>
           <w:bCs/>
         </w:rPr>
-        <w:t>RASCUNHO, ENVIADO, EM_</w:t>
-      </w:r>
-      <w:proofErr w:type="gramStart"/>
-      <w:r>
-        <w:rPr>
-          <w:rFonts w:ascii="Arial" w:hAnsi="Arial" w:cs="Arial"/>
-          <w:b/>
-          <w:bCs/>
-        </w:rPr>
-        <w:t>ANALISE</w:t>
-      </w:r>
-      <w:proofErr w:type="gramEnd"/>
-      <w:r>
-        <w:rPr>
-          <w:rFonts w:ascii="Arial" w:hAnsi="Arial" w:cs="Arial"/>
-          <w:b/>
-          <w:bCs/>
-        </w:rPr>
-        <w:t>, APROVADO, RECUSADO, EXPIRADO, CANCELADO e CONCLUIDO.</w:t>
+        <w:t>RASCUNHO, ENVIADO, EM_ANALISE, APROVADO, RECUSADO, EXPIRADO, CANCELADO e CONCLUIDO.</w:t>
       </w:r>
     </w:p>
     <w:p>
@@ -1510,18 +1508,8 @@
           <w:b/>
           <w:bCs/>
         </w:rPr>
-        <w:t>ENVIADO → EM_</w:t>
-      </w:r>
-      <w:proofErr w:type="gramStart"/>
-      <w:r>
-        <w:rPr>
-          <w:rFonts w:ascii="Arial" w:hAnsi="Arial" w:cs="Arial"/>
-          <w:b/>
-          <w:bCs/>
-        </w:rPr>
-        <w:t>ANALISE</w:t>
-      </w:r>
-      <w:proofErr w:type="gramEnd"/>
+        <w:t>ENVIADO → EM_ANALISE</w:t>
+      </w:r>
     </w:p>
     <w:p>
       <w:pPr>
@@ -1580,130 +1568,58 @@
           <w:b/>
           <w:bCs/>
         </w:rPr>
-        <w:t>EM_</w:t>
-      </w:r>
-      <w:proofErr w:type="gramStart"/>
-      <w:r>
-        <w:rPr>
-          <w:rFonts w:ascii="Arial" w:hAnsi="Arial" w:cs="Arial"/>
-          <w:b/>
-          <w:bCs/>
-        </w:rPr>
-        <w:t>ANALISE</w:t>
-      </w:r>
-      <w:proofErr w:type="gramEnd"/>
-      <w:r>
-        <w:rPr>
-          <w:rFonts w:ascii="Arial" w:hAnsi="Arial" w:cs="Arial"/>
-          <w:b/>
-          <w:bCs/>
-        </w:rPr>
-        <w:t xml:space="preserve"> → APROVADO</w:t>
-      </w:r>
-    </w:p>
-    <w:p>
-      <w:pPr>
-        <w:rPr>
-          <w:rFonts w:ascii="Arial" w:hAnsi="Arial" w:cs="Arial"/>
-          <w:b/>
-          <w:bCs/>
-        </w:rPr>
-      </w:pPr>
-      <w:r>
-        <w:rPr>
-          <w:rFonts w:ascii="Arial" w:hAnsi="Arial" w:cs="Arial"/>
-          <w:b/>
-          <w:bCs/>
-        </w:rPr>
-        <w:t>EM_</w:t>
-      </w:r>
-      <w:proofErr w:type="gramStart"/>
-      <w:r>
-        <w:rPr>
-          <w:rFonts w:ascii="Arial" w:hAnsi="Arial" w:cs="Arial"/>
-          <w:b/>
-          <w:bCs/>
-        </w:rPr>
-        <w:t>ANALISE</w:t>
-      </w:r>
-      <w:proofErr w:type="gramEnd"/>
-      <w:r>
-        <w:rPr>
-          <w:rFonts w:ascii="Arial" w:hAnsi="Arial" w:cs="Arial"/>
-          <w:b/>
-          <w:bCs/>
-        </w:rPr>
-        <w:t xml:space="preserve"> → RECUSADO</w:t>
-      </w:r>
-    </w:p>
-    <w:p>
-      <w:pPr>
-        <w:rPr>
-          <w:rFonts w:ascii="Arial" w:hAnsi="Arial" w:cs="Arial"/>
-          <w:b/>
-          <w:bCs/>
-        </w:rPr>
-      </w:pPr>
-      <w:r>
-        <w:rPr>
-          <w:rFonts w:ascii="Arial" w:hAnsi="Arial" w:cs="Arial"/>
-          <w:b/>
-          <w:bCs/>
-        </w:rPr>
-        <w:t>EM_</w:t>
-      </w:r>
-      <w:proofErr w:type="gramStart"/>
-      <w:r>
-        <w:rPr>
-          <w:rFonts w:ascii="Arial" w:hAnsi="Arial" w:cs="Arial"/>
-          <w:b/>
-          <w:bCs/>
-        </w:rPr>
-        <w:t>ANALISE</w:t>
-      </w:r>
-      <w:proofErr w:type="gramEnd"/>
-      <w:r>
-        <w:rPr>
-          <w:rFonts w:ascii="Arial" w:hAnsi="Arial" w:cs="Arial"/>
-          <w:b/>
-          <w:bCs/>
-        </w:rPr>
-        <w:t xml:space="preserve"> → EXPIRADO</w:t>
-      </w:r>
-    </w:p>
-    <w:p>
-      <w:pPr>
-        <w:rPr>
-          <w:rFonts w:ascii="Arial" w:hAnsi="Arial" w:cs="Arial"/>
-          <w:b/>
-          <w:bCs/>
-        </w:rPr>
-      </w:pPr>
-      <w:r>
-        <w:rPr>
-          <w:rFonts w:ascii="Arial" w:hAnsi="Arial" w:cs="Arial"/>
-          <w:b/>
-          <w:bCs/>
-        </w:rPr>
-        <w:t>EM_</w:t>
-      </w:r>
-      <w:proofErr w:type="gramStart"/>
-      <w:r>
-        <w:rPr>
-          <w:rFonts w:ascii="Arial" w:hAnsi="Arial" w:cs="Arial"/>
-          <w:b/>
-          <w:bCs/>
-        </w:rPr>
-        <w:t>ANALISE</w:t>
-      </w:r>
-      <w:proofErr w:type="gramEnd"/>
-      <w:r>
-        <w:rPr>
-          <w:rFonts w:ascii="Arial" w:hAnsi="Arial" w:cs="Arial"/>
-          <w:b/>
-          <w:bCs/>
-        </w:rPr>
-        <w:t xml:space="preserve"> → CANCELADO</w:t>
+        <w:t>EM_ANALISE → APROVADO</w:t>
+      </w:r>
+    </w:p>
+    <w:p>
+      <w:pPr>
+        <w:rPr>
+          <w:rFonts w:ascii="Arial" w:hAnsi="Arial" w:cs="Arial"/>
+          <w:b/>
+          <w:bCs/>
+        </w:rPr>
+      </w:pPr>
+      <w:r>
+        <w:rPr>
+          <w:rFonts w:ascii="Arial" w:hAnsi="Arial" w:cs="Arial"/>
+          <w:b/>
+          <w:bCs/>
+        </w:rPr>
+        <w:t>EM_ANALISE → RECUSADO</w:t>
+      </w:r>
+    </w:p>
+    <w:p>
+      <w:pPr>
+        <w:rPr>
+          <w:rFonts w:ascii="Arial" w:hAnsi="Arial" w:cs="Arial"/>
+          <w:b/>
+          <w:bCs/>
+        </w:rPr>
+      </w:pPr>
+      <w:r>
+        <w:rPr>
+          <w:rFonts w:ascii="Arial" w:hAnsi="Arial" w:cs="Arial"/>
+          <w:b/>
+          <w:bCs/>
+        </w:rPr>
+        <w:t>EM_ANALISE → EXPIRADO</w:t>
+      </w:r>
+    </w:p>
+    <w:p>
+      <w:pPr>
+        <w:rPr>
+          <w:rFonts w:ascii="Arial" w:hAnsi="Arial" w:cs="Arial"/>
+          <w:b/>
+          <w:bCs/>
+        </w:rPr>
+      </w:pPr>
+      <w:r>
+        <w:rPr>
+          <w:rFonts w:ascii="Arial" w:hAnsi="Arial" w:cs="Arial"/>
+          <w:b/>
+          <w:bCs/>
+        </w:rPr>
+        <w:t>EM_ANALISE → CANCELADO</w:t>
       </w:r>
     </w:p>
     <w:p>
@@ -1763,25 +1679,7 @@
           <w:b/>
           <w:bCs/>
         </w:rPr>
-        <w:t>RN65. Orçamentos em ENVIADO, EM_</w:t>
-      </w:r>
-      <w:proofErr w:type="gramStart"/>
-      <w:r>
-        <w:rPr>
-          <w:rFonts w:ascii="Arial" w:hAnsi="Arial" w:cs="Arial"/>
-          <w:b/>
-          <w:bCs/>
-        </w:rPr>
-        <w:t>ANALISE</w:t>
-      </w:r>
-      <w:proofErr w:type="gramEnd"/>
-      <w:r>
-        <w:rPr>
-          <w:rFonts w:ascii="Arial" w:hAnsi="Arial" w:cs="Arial"/>
-          <w:b/>
-          <w:bCs/>
-        </w:rPr>
-        <w:t>, APROVADO, RECUSADO, EXPIRADO, CANCELADO ou CONCLUIDO não devem ser editados diretamente.</w:t>
+        <w:t>RN65. Orçamentos em ENVIADO, EM_ANALISE, APROVADO, RECUSADO, EXPIRADO, CANCELADO ou CONCLUIDO não devem ser editados diretamente.</w:t>
       </w:r>
     </w:p>
     <w:p>
@@ -1850,25 +1748,7 @@
           <w:b/>
           <w:bCs/>
         </w:rPr>
-        <w:t>RN69. Um orçamento ENVIADO ou EM_</w:t>
-      </w:r>
-      <w:proofErr w:type="gramStart"/>
-      <w:r>
-        <w:rPr>
-          <w:rFonts w:ascii="Arial" w:hAnsi="Arial" w:cs="Arial"/>
-          <w:b/>
-          <w:bCs/>
-        </w:rPr>
-        <w:t>ANALISE</w:t>
-      </w:r>
-      <w:proofErr w:type="gramEnd"/>
-      <w:r>
-        <w:rPr>
-          <w:rFonts w:ascii="Arial" w:hAnsi="Arial" w:cs="Arial"/>
-          <w:b/>
-          <w:bCs/>
-        </w:rPr>
-        <w:t xml:space="preserve"> deve ser considerado EXPIRADO quando sua validade for ultrapassada.</w:t>
+        <w:t>RN69. Um orçamento ENVIADO ou EM_ANALISE deve ser considerado EXPIRADO quando sua validade for ultrapassada.</w:t>
       </w:r>
     </w:p>
     <w:p>
@@ -1920,7 +1800,7 @@
           <w:bCs/>
         </w:rPr>
         <w:pict w14:anchorId="2F6D95EF">
-          <v:rect id="_x0000_i1155" style="width:0;height:1.5pt" o:hralign="center" o:hrstd="t" o:hr="t" fillcolor="#a0a0a0" stroked="f"/>
+          <v:rect id="_x0000_i1034" style="width:0;height:1.5pt" o:hralign="center" o:hrstd="t" o:hr="t" fillcolor="#a0a0a0" stroked="f"/>
         </w:pict>
       </w:r>
     </w:p>
@@ -1972,25 +1852,7 @@
           <w:b/>
           <w:bCs/>
         </w:rPr>
-        <w:t xml:space="preserve">RN73. A duplicação deve </w:t>
-      </w:r>
-      <w:proofErr w:type="gramStart"/>
-      <w:r>
-        <w:rPr>
-          <w:rFonts w:ascii="Arial" w:hAnsi="Arial" w:cs="Arial"/>
-          <w:b/>
-          <w:bCs/>
-        </w:rPr>
-        <w:t>criar um novo</w:t>
-      </w:r>
-      <w:proofErr w:type="gramEnd"/>
-      <w:r>
-        <w:rPr>
-          <w:rFonts w:ascii="Arial" w:hAnsi="Arial" w:cs="Arial"/>
-          <w:b/>
-          <w:bCs/>
-        </w:rPr>
-        <w:t xml:space="preserve"> orçamento com identificador e número próprios e status inicial RASCUNHO.</w:t>
+        <w:t>RN73. A duplicação deve criar um novo orçamento com identificador e número próprios e status inicial RASCUNHO.</w:t>
       </w:r>
     </w:p>
     <w:p>
@@ -2058,25 +1920,7 @@
           <w:b/>
           <w:bCs/>
         </w:rPr>
-        <w:t xml:space="preserve">RN77. A duplicação deve ser utilizada para </w:t>
-      </w:r>
-      <w:proofErr w:type="gramStart"/>
-      <w:r>
-        <w:rPr>
-          <w:rFonts w:ascii="Arial" w:hAnsi="Arial" w:cs="Arial"/>
-          <w:b/>
-          <w:bCs/>
-        </w:rPr>
-        <w:t>criar uma nova</w:t>
-      </w:r>
-      <w:proofErr w:type="gramEnd"/>
-      <w:r>
-        <w:rPr>
-          <w:rFonts w:ascii="Arial" w:hAnsi="Arial" w:cs="Arial"/>
-          <w:b/>
-          <w:bCs/>
-        </w:rPr>
-        <w:t xml:space="preserve"> proposta a partir de um orçamento existente sem reabrir ou modificar seu histórico.</w:t>
+        <w:t>RN77. A duplicação deve ser utilizada para criar uma nova proposta a partir de um orçamento existente sem reabrir ou modificar seu histórico.</w:t>
       </w:r>
     </w:p>
     <w:p>
@@ -2094,7 +1938,7 @@
           <w:bCs/>
         </w:rPr>
         <w:pict w14:anchorId="1A1DB4BD">
-          <v:rect id="_x0000_i1156" style="width:0;height:1.5pt" o:hralign="center" o:hrstd="t" o:hr="t" fillcolor="#a0a0a0" stroked="f"/>
+          <v:rect id="_x0000_i1035" style="width:0;height:1.5pt" o:hralign="center" o:hrstd="t" o:hr="t" fillcolor="#a0a0a0" stroked="f"/>
         </w:pict>
       </w:r>
     </w:p>
@@ -4176,6 +4020,7 @@
   <w:style w:type="character" w:default="1" w:styleId="Fontepargpadro">
     <w:name w:val="Default Paragraph Font"/>
     <w:uiPriority w:val="1"/>
+    <w:semiHidden/>
     <w:unhideWhenUsed/>
   </w:style>
   <w:style w:type="table" w:default="1" w:styleId="Tabelanormal">

</xml_diff>